<commit_message>
remove duplicate CLAUDE.md from Baseline Files
</commit_message>
<xml_diff>
--- a/Baseline Files/baseline-backlog.docx
+++ b/Baseline Files/baseline-backlog.docx
@@ -2248,7 +2248,7 @@
                 <w:sz w:val="19"/>
                 <w:szCs w:val="19"/>
               </w:rPr>
-              <w:t xml:space="preserve">Check-in tutorial section in Help page</w:t>
+              <w:t xml:space="preserve">Check-in tutorial section in Help page — Deployed Mar 4, 2026</w:t>
             </w:r>
           </w:p>
         </w:tc>
@@ -2403,7 +2403,7 @@
                 <w:sz w:val="19"/>
                 <w:szCs w:val="19"/>
               </w:rPr>
-              <w:t xml:space="preserve">Add Help page with all sections including Dashboard explanation</w:t>
+              <w:t xml:space="preserve">Add Help page with all sections including Dashboard explanation — Deployed Mar 4, 2026</w:t>
             </w:r>
           </w:p>
         </w:tc>

</xml_diff>